<commit_message>
Nội dung cập nhật
</commit_message>
<xml_diff>
--- a/backend/document_templates/Don_xin_bao_luu_template.docx
+++ b/backend/document_templates/Don_xin_bao_luu_template.docx
@@ -1,6 +1,6 @@
 
 <file path=word/document.xml><?xml version="1.0" encoding="utf-8"?>
-<w:document xmlns:wpc="http://schemas.microsoft.com/office/word/2010/wordprocessingCanvas" xmlns:cx="http://schemas.microsoft.com/office/drawing/2014/chartex" xmlns:mc="http://schemas.openxmlformats.org/markup-compatibility/2006" xmlns:o="urn:schemas-microsoft-com:office:office" xmlns:r="http://schemas.openxmlformats.org/officeDocument/2006/relationships" xmlns:m="http://schemas.openxmlformats.org/officeDocument/2006/math" xmlns:v="urn:schemas-microsoft-com:vml" xmlns:wp14="http://schemas.microsoft.com/office/word/2010/wordprocessingDrawing" xmlns:wp="http://schemas.openxmlformats.org/drawingml/2006/wordprocessingDrawing" xmlns:w10="urn:schemas-microsoft-com:office:word" xmlns:w="http://schemas.openxmlformats.org/wordprocessingml/2006/main" xmlns:w14="http://schemas.microsoft.com/office/word/2010/wordml" xmlns:w15="http://schemas.microsoft.com/office/word/2012/wordml" xmlns:w16se="http://schemas.microsoft.com/office/word/2015/wordml/symex" xmlns:wpg="http://schemas.microsoft.com/office/word/2010/wordprocessingGroup" xmlns:wpi="http://schemas.microsoft.com/office/word/2010/wordprocessingInk" xmlns:wne="http://schemas.microsoft.com/office/word/2006/wordml" xmlns:wps="http://schemas.microsoft.com/office/word/2010/wordprocessingShape" mc:Ignorable="w14 w15 w16se wp14">
+<w:document xmlns:wpc="http://schemas.microsoft.com/office/word/2010/wordprocessingCanvas" xmlns:cx="http://schemas.microsoft.com/office/drawing/2014/chartex" xmlns:cx1="http://schemas.microsoft.com/office/drawing/2015/9/8/chartex" xmlns:cx2="http://schemas.microsoft.com/office/drawing/2015/10/21/chartex" xmlns:cx3="http://schemas.microsoft.com/office/drawing/2016/5/9/chartex" xmlns:cx4="http://schemas.microsoft.com/office/drawing/2016/5/10/chartex" xmlns:cx5="http://schemas.microsoft.com/office/drawing/2016/5/11/chartex" xmlns:cx6="http://schemas.microsoft.com/office/drawing/2016/5/12/chartex" xmlns:cx7="http://schemas.microsoft.com/office/drawing/2016/5/13/chartex" xmlns:cx8="http://schemas.microsoft.com/office/drawing/2016/5/14/chartex" xmlns:mc="http://schemas.openxmlformats.org/markup-compatibility/2006" xmlns:aink="http://schemas.microsoft.com/office/drawing/2016/ink" xmlns:am3d="http://schemas.microsoft.com/office/drawing/2017/model3d" xmlns:o="urn:schemas-microsoft-com:office:office" xmlns:oel="http://schemas.microsoft.com/office/2019/extlst" xmlns:r="http://schemas.openxmlformats.org/officeDocument/2006/relationships" xmlns:m="http://schemas.openxmlformats.org/officeDocument/2006/math" xmlns:v="urn:schemas-microsoft-com:vml" xmlns:wp14="http://schemas.microsoft.com/office/word/2010/wordprocessingDrawing" xmlns:wp="http://schemas.openxmlformats.org/drawingml/2006/wordprocessingDrawing" xmlns:w10="urn:schemas-microsoft-com:office:word" xmlns:w="http://schemas.openxmlformats.org/wordprocessingml/2006/main" xmlns:w14="http://schemas.microsoft.com/office/word/2010/wordml" xmlns:w15="http://schemas.microsoft.com/office/word/2012/wordml" xmlns:w16cex="http://schemas.microsoft.com/office/word/2018/wordml/cex" xmlns:w16cid="http://schemas.microsoft.com/office/word/2016/wordml/cid" xmlns:w16="http://schemas.microsoft.com/office/word/2018/wordml" xmlns:w16du="http://schemas.microsoft.com/office/word/2023/wordml/word16du" xmlns:w16sdtdh="http://schemas.microsoft.com/office/word/2020/wordml/sdtdatahash" xmlns:w16sdtfl="http://schemas.microsoft.com/office/word/2024/wordml/sdtformatlock" xmlns:w16se="http://schemas.microsoft.com/office/word/2015/wordml/symex" xmlns:wpg="http://schemas.microsoft.com/office/word/2010/wordprocessingGroup" xmlns:wpi="http://schemas.microsoft.com/office/word/2010/wordprocessingInk" xmlns:wne="http://schemas.microsoft.com/office/word/2006/wordml" xmlns:wps="http://schemas.microsoft.com/office/word/2010/wordprocessingShape" mc:Ignorable="w14 w15 w16se w16cid w16 w16cex w16sdtdh w16sdtfl w16du wp14">
   <w:body>
     <w:tbl>
       <w:tblPr>
@@ -19,7 +19,6 @@
         <w:tc>
           <w:tcPr>
             <w:tcW w:w="3794" w:type="dxa"/>
-            <w:shd w:val="clear" w:color="auto" w:fill="auto"/>
           </w:tcPr>
           <w:p>
             <w:pPr>
@@ -117,7 +116,7 @@
                     </wp:anchor>
                   </w:drawing>
                 </mc:Choice>
-                <mc:Fallback xmlns:w16sdtdh="http://schemas.microsoft.com/office/word/2020/wordml/sdtdatahash" xmlns:w16="http://schemas.microsoft.com/office/word/2018/wordml" xmlns:w16cid="http://schemas.microsoft.com/office/word/2016/wordml/cid" xmlns:w16cex="http://schemas.microsoft.com/office/word/2018/wordml/cex" xmlns:oel="http://schemas.microsoft.com/office/2019/extlst" xmlns:am3d="http://schemas.microsoft.com/office/drawing/2017/model3d" xmlns:aink="http://schemas.microsoft.com/office/drawing/2016/ink" xmlns:cx8="http://schemas.microsoft.com/office/drawing/2016/5/14/chartex" xmlns:cx7="http://schemas.microsoft.com/office/drawing/2016/5/13/chartex" xmlns:cx6="http://schemas.microsoft.com/office/drawing/2016/5/12/chartex" xmlns:cx5="http://schemas.microsoft.com/office/drawing/2016/5/11/chartex" xmlns:cx4="http://schemas.microsoft.com/office/drawing/2016/5/10/chartex" xmlns:cx3="http://schemas.microsoft.com/office/drawing/2016/5/9/chartex" xmlns:cx2="http://schemas.microsoft.com/office/drawing/2015/10/21/chartex" xmlns:cx1="http://schemas.microsoft.com/office/drawing/2015/9/8/chartex">
+                <mc:Fallback>
                   <w:pict>
                     <v:shapetype w14:anchorId="323A5741" id="_x0000_t32" coordsize="21600,21600" o:spt="32" o:oned="t" path="m,l21600,21600e" filled="f">
                       <v:path arrowok="t" fillok="f" o:connecttype="none"/>
@@ -143,7 +142,6 @@
         <w:tc>
           <w:tcPr>
             <w:tcW w:w="5670" w:type="dxa"/>
-            <w:shd w:val="clear" w:color="auto" w:fill="auto"/>
           </w:tcPr>
           <w:p>
             <w:pPr>
@@ -241,7 +239,7 @@
                     </wp:anchor>
                   </w:drawing>
                 </mc:Choice>
-                <mc:Fallback xmlns:w16sdtdh="http://schemas.microsoft.com/office/word/2020/wordml/sdtdatahash" xmlns:w16="http://schemas.microsoft.com/office/word/2018/wordml" xmlns:w16cid="http://schemas.microsoft.com/office/word/2016/wordml/cid" xmlns:w16cex="http://schemas.microsoft.com/office/word/2018/wordml/cex" xmlns:oel="http://schemas.microsoft.com/office/2019/extlst" xmlns:am3d="http://schemas.microsoft.com/office/drawing/2017/model3d" xmlns:aink="http://schemas.microsoft.com/office/drawing/2016/ink" xmlns:cx8="http://schemas.microsoft.com/office/drawing/2016/5/14/chartex" xmlns:cx7="http://schemas.microsoft.com/office/drawing/2016/5/13/chartex" xmlns:cx6="http://schemas.microsoft.com/office/drawing/2016/5/12/chartex" xmlns:cx5="http://schemas.microsoft.com/office/drawing/2016/5/11/chartex" xmlns:cx4="http://schemas.microsoft.com/office/drawing/2016/5/10/chartex" xmlns:cx3="http://schemas.microsoft.com/office/drawing/2016/5/9/chartex" xmlns:cx2="http://schemas.microsoft.com/office/drawing/2015/10/21/chartex" xmlns:cx1="http://schemas.microsoft.com/office/drawing/2015/9/8/chartex">
+                <mc:Fallback>
                   <w:pict>
                     <v:shape w14:anchorId="2555B5FD" id="Straight Arrow Connector 1" o:spid="_x0000_s1026" type="#_x0000_t32" style="position:absolute;margin-left:57pt;margin-top:16.95pt;width:158.75pt;height:0;z-index:251660288;visibility:visible;mso-wrap-style:square;mso-width-percent:0;mso-height-percent:0;mso-wrap-distance-left:9pt;mso-wrap-distance-top:0;mso-wrap-distance-right:9pt;mso-wrap-distance-bottom:0;mso-position-horizontal:absolute;mso-position-horizontal-relative:margin;mso-position-vertical:absolute;mso-position-vertical-relative:text;mso-width-percent:0;mso-height-percent:0;mso-width-relative:page;mso-height-relative:page" o:gfxdata="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">
                       <w10:wrap anchorx="margin"/>
@@ -502,6 +500,22 @@
           <w:sz w:val="26"/>
           <w:szCs w:val="26"/>
         </w:rPr>
+        <w:t xml:space="preserve"> Trường </w:t>
+      </w:r>
+      <w:proofErr w:type="spellStart"/>
+      <w:r>
+        <w:rPr>
+          <w:sz w:val="26"/>
+          <w:szCs w:val="26"/>
+        </w:rPr>
+        <w:t>Đại</w:t>
+      </w:r>
+      <w:proofErr w:type="spellEnd"/>
+      <w:r>
+        <w:rPr>
+          <w:sz w:val="26"/>
+          <w:szCs w:val="26"/>
+        </w:rPr>
         <w:t xml:space="preserve"> </w:t>
       </w:r>
       <w:proofErr w:type="spellStart"/>
@@ -510,7 +524,7 @@
           <w:sz w:val="26"/>
           <w:szCs w:val="26"/>
         </w:rPr>
-        <w:t>Trường</w:t>
+        <w:t>học</w:t>
       </w:r>
       <w:proofErr w:type="spellEnd"/>
       <w:r>
@@ -518,55 +532,7 @@
           <w:sz w:val="26"/>
           <w:szCs w:val="26"/>
         </w:rPr>
-        <w:t xml:space="preserve"> </w:t>
-      </w:r>
-      <w:proofErr w:type="spellStart"/>
-      <w:r>
-        <w:rPr>
-          <w:sz w:val="26"/>
-          <w:szCs w:val="26"/>
-        </w:rPr>
-        <w:t>Đại</w:t>
-      </w:r>
-      <w:proofErr w:type="spellEnd"/>
-      <w:r>
-        <w:rPr>
-          <w:sz w:val="26"/>
-          <w:szCs w:val="26"/>
-        </w:rPr>
-        <w:t xml:space="preserve"> </w:t>
-      </w:r>
-      <w:proofErr w:type="spellStart"/>
-      <w:r>
-        <w:rPr>
-          <w:sz w:val="26"/>
-          <w:szCs w:val="26"/>
-        </w:rPr>
-        <w:t>học</w:t>
-      </w:r>
-      <w:proofErr w:type="spellEnd"/>
-      <w:r>
-        <w:rPr>
-          <w:sz w:val="26"/>
-          <w:szCs w:val="26"/>
-        </w:rPr>
-        <w:t xml:space="preserve"> </w:t>
-      </w:r>
-      <w:proofErr w:type="spellStart"/>
-      <w:r>
-        <w:rPr>
-          <w:sz w:val="26"/>
-          <w:szCs w:val="26"/>
-        </w:rPr>
-        <w:t>Kinh</w:t>
-      </w:r>
-      <w:proofErr w:type="spellEnd"/>
-      <w:r>
-        <w:rPr>
-          <w:sz w:val="26"/>
-          <w:szCs w:val="26"/>
-        </w:rPr>
-        <w:t xml:space="preserve"> </w:t>
+        <w:t xml:space="preserve"> Kinh </w:t>
       </w:r>
       <w:proofErr w:type="spellStart"/>
       <w:r>
@@ -619,7 +585,7 @@
           <w:sz w:val="26"/>
           <w:szCs w:val="26"/>
         </w:rPr>
-        <w:t xml:space="preserve"> </w:t>
+        <w:t xml:space="preserve"> Đào </w:t>
       </w:r>
       <w:proofErr w:type="spellStart"/>
       <w:r>
@@ -627,7 +593,7 @@
           <w:sz w:val="26"/>
           <w:szCs w:val="26"/>
         </w:rPr>
-        <w:t>Đào</w:t>
+        <w:t>tạo</w:t>
       </w:r>
       <w:proofErr w:type="spellEnd"/>
       <w:r>
@@ -635,7 +601,7 @@
           <w:sz w:val="26"/>
           <w:szCs w:val="26"/>
         </w:rPr>
-        <w:t xml:space="preserve"> tạo;</w:t>
+        <w:t>;</w:t>
       </w:r>
     </w:p>
     <w:p>
@@ -651,12 +617,6 @@
           <w:szCs w:val="26"/>
         </w:rPr>
       </w:pPr>
-      <w:proofErr w:type="spellStart"/>
-      <w:proofErr w:type="spellEnd"/>
-      <w:proofErr w:type="spellStart"/>
-      <w:proofErr w:type="spellEnd"/>
-      <w:proofErr w:type="spellStart"/>
-      <w:proofErr w:type="spellEnd"/>
       <w:r>
         <w:rPr>
           <w:sz w:val="26"/>
@@ -714,22 +674,18 @@
           <w:szCs w:val="26"/>
         </w:rPr>
       </w:pPr>
-      <w:proofErr w:type="spellStart"/>
-      <w:proofErr w:type="spellEnd"/>
-      <w:proofErr w:type="spellStart"/>
-      <w:proofErr w:type="spellEnd"/>
-      <w:proofErr w:type="spellStart"/>
-      <w:proofErr w:type="spellEnd"/>
-      <w:proofErr w:type="spellStart"/>
-      <w:proofErr w:type="spellEnd"/>
-      <w:proofErr w:type="spellStart"/>
-      <w:proofErr w:type="spellEnd"/>
       <w:r>
         <w:rPr>
           <w:sz w:val="26"/>
           <w:szCs w:val="26"/>
         </w:rPr>
         <w:t>Họ và tên: {{ full_name }}</w:t>
+      </w:r>
+      <w:r>
+        <w:rPr>
+          <w:sz w:val="26"/>
+          <w:szCs w:val="26"/>
+        </w:rPr>
         <w:tab/>
         <w:t>Ngày sinh: {{ date_of_birth }}</w:t>
       </w:r>
@@ -748,18 +704,18 @@
           <w:szCs w:val="26"/>
         </w:rPr>
       </w:pPr>
-      <w:proofErr w:type="spellStart"/>
-      <w:proofErr w:type="spellEnd"/>
-      <w:proofErr w:type="spellStart"/>
-      <w:proofErr w:type="spellEnd"/>
-      <w:proofErr w:type="spellStart"/>
-      <w:proofErr w:type="spellEnd"/>
       <w:r>
         <w:rPr>
           <w:sz w:val="26"/>
           <w:szCs w:val="26"/>
         </w:rPr>
         <w:t>Sinh viên lớp: {{ class_name }}</w:t>
+      </w:r>
+      <w:r>
+        <w:rPr>
+          <w:sz w:val="26"/>
+          <w:szCs w:val="26"/>
+        </w:rPr>
         <w:tab/>
         <w:t>MSSV: {{ student_id }}</w:t>
       </w:r>
@@ -778,18 +734,18 @@
           <w:szCs w:val="26"/>
         </w:rPr>
       </w:pPr>
-      <w:proofErr w:type="spellStart"/>
-      <w:proofErr w:type="spellEnd"/>
-      <w:proofErr w:type="spellStart"/>
-      <w:proofErr w:type="spellEnd"/>
-      <w:proofErr w:type="spellStart"/>
-      <w:proofErr w:type="spellEnd"/>
       <w:r>
         <w:rPr>
           <w:sz w:val="26"/>
           <w:szCs w:val="26"/>
         </w:rPr>
         <w:t>Số điện thoại: {{ phone }}</w:t>
+      </w:r>
+      <w:r>
+        <w:rPr>
+          <w:sz w:val="26"/>
+          <w:szCs w:val="26"/>
+        </w:rPr>
         <w:tab/>
         <w:t>Email: {{ email }}</w:t>
       </w:r>
@@ -806,90 +762,6 @@
           <w:szCs w:val="26"/>
         </w:rPr>
       </w:pPr>
-      <w:proofErr w:type="spellStart"/>
-      <w:proofErr w:type="spellEnd"/>
-      <w:proofErr w:type="spellStart"/>
-      <w:proofErr w:type="spellEnd"/>
-      <w:proofErr w:type="spellStart"/>
-      <w:proofErr w:type="spellEnd"/>
-      <w:proofErr w:type="spellStart"/>
-      <w:proofErr w:type="spellEnd"/>
-      <w:proofErr w:type="spellStart"/>
-      <w:proofErr w:type="spellEnd"/>
-      <w:proofErr w:type="spellStart"/>
-      <w:proofErr w:type="spellEnd"/>
-      <w:proofErr w:type="spellStart"/>
-      <w:proofErr w:type="spellEnd"/>
-      <w:proofErr w:type="spellStart"/>
-      <w:proofErr w:type="spellEnd"/>
-      <w:proofErr w:type="spellStart"/>
-      <w:proofErr w:type="spellEnd"/>
-      <w:proofErr w:type="spellStart"/>
-      <w:proofErr w:type="spellEnd"/>
-      <w:proofErr w:type="spellStart"/>
-      <w:proofErr w:type="spellEnd"/>
-      <w:proofErr w:type="spellStart"/>
-      <w:proofErr w:type="spellEnd"/>
-      <w:proofErr w:type="spellStart"/>
-      <w:proofErr w:type="spellEnd"/>
-      <w:proofErr w:type="spellStart"/>
-      <w:proofErr w:type="spellEnd"/>
-      <w:proofErr w:type="spellStart"/>
-      <w:proofErr w:type="spellEnd"/>
-      <w:proofErr w:type="spellStart"/>
-      <w:proofErr w:type="spellEnd"/>
-      <w:proofErr w:type="spellStart"/>
-      <w:proofErr w:type="spellEnd"/>
-      <w:proofErr w:type="spellStart"/>
-      <w:proofErr w:type="spellEnd"/>
-      <w:proofErr w:type="spellStart"/>
-      <w:proofErr w:type="spellEnd"/>
-      <w:proofErr w:type="spellStart"/>
-      <w:proofErr w:type="spellEnd"/>
-      <w:proofErr w:type="spellStart"/>
-      <w:proofErr w:type="spellEnd"/>
-      <w:proofErr w:type="spellStart"/>
-      <w:proofErr w:type="spellEnd"/>
-      <w:proofErr w:type="spellStart"/>
-      <w:proofErr w:type="spellEnd"/>
-      <w:proofErr w:type="spellStart"/>
-      <w:proofErr w:type="spellEnd"/>
-      <w:proofErr w:type="spellStart"/>
-      <w:proofErr w:type="spellEnd"/>
-      <w:proofErr w:type="spellStart"/>
-      <w:proofErr w:type="spellEnd"/>
-      <w:proofErr w:type="spellStart"/>
-      <w:proofErr w:type="spellEnd"/>
-      <w:proofErr w:type="spellStart"/>
-      <w:proofErr w:type="spellEnd"/>
-      <w:proofErr w:type="spellStart"/>
-      <w:proofErr w:type="spellEnd"/>
-      <w:proofErr w:type="spellStart"/>
-      <w:proofErr w:type="spellEnd"/>
-      <w:proofErr w:type="spellStart"/>
-      <w:proofErr w:type="spellEnd"/>
-      <w:proofErr w:type="spellStart"/>
-      <w:proofErr w:type="spellEnd"/>
-      <w:proofErr w:type="spellStart"/>
-      <w:proofErr w:type="spellEnd"/>
-      <w:proofErr w:type="spellStart"/>
-      <w:proofErr w:type="spellEnd"/>
-      <w:proofErr w:type="spellStart"/>
-      <w:proofErr w:type="spellEnd"/>
-      <w:proofErr w:type="spellStart"/>
-      <w:proofErr w:type="spellEnd"/>
-      <w:proofErr w:type="spellStart"/>
-      <w:proofErr w:type="spellEnd"/>
-      <w:proofErr w:type="spellStart"/>
-      <w:proofErr w:type="spellEnd"/>
-      <w:proofErr w:type="spellStart"/>
-      <w:proofErr w:type="spellEnd"/>
-      <w:proofErr w:type="spellStart"/>
-      <w:proofErr w:type="spellEnd"/>
-      <w:proofErr w:type="spellStart"/>
-      <w:proofErr w:type="spellEnd"/>
-      <w:proofErr w:type="spellStart"/>
-      <w:proofErr w:type="spellEnd"/>
       <w:r>
         <w:rPr>
           <w:sz w:val="26"/>
@@ -911,8 +783,6 @@
           <w:szCs w:val="26"/>
         </w:rPr>
       </w:pPr>
-      <w:proofErr w:type="spellStart"/>
-      <w:proofErr w:type="spellEnd"/>
       <w:r>
         <w:rPr>
           <w:sz w:val="26"/>
@@ -933,12 +803,6 @@
           <w:szCs w:val="26"/>
         </w:rPr>
       </w:pPr>
-      <w:r>
-        <w:rPr>
-          <w:sz w:val="26"/>
-          <w:szCs w:val="26"/>
-        </w:rPr>
-      </w:r>
     </w:p>
     <w:p>
       <w:pPr>
@@ -952,12 +816,6 @@
           <w:szCs w:val="26"/>
         </w:rPr>
       </w:pPr>
-      <w:r>
-        <w:rPr>
-          <w:sz w:val="26"/>
-          <w:szCs w:val="26"/>
-        </w:rPr>
-      </w:r>
     </w:p>
     <w:p>
       <w:pPr>
@@ -971,12 +829,6 @@
           <w:szCs w:val="26"/>
         </w:rPr>
       </w:pPr>
-      <w:r>
-        <w:rPr>
-          <w:sz w:val="26"/>
-          <w:szCs w:val="26"/>
-        </w:rPr>
-      </w:r>
     </w:p>
     <w:p>
       <w:pPr>
@@ -990,18 +842,6 @@
           <w:szCs w:val="26"/>
         </w:rPr>
       </w:pPr>
-      <w:proofErr w:type="spellStart"/>
-      <w:proofErr w:type="spellEnd"/>
-      <w:proofErr w:type="spellStart"/>
-      <w:proofErr w:type="spellEnd"/>
-      <w:proofErr w:type="spellStart"/>
-      <w:proofErr w:type="spellEnd"/>
-      <w:proofErr w:type="spellStart"/>
-      <w:proofErr w:type="spellEnd"/>
-      <w:proofErr w:type="spellStart"/>
-      <w:proofErr w:type="spellEnd"/>
-      <w:proofErr w:type="spellStart"/>
-      <w:proofErr w:type="spellEnd"/>
       <w:r>
         <w:rPr>
           <w:sz w:val="26"/>
@@ -1149,23 +989,7 @@
           <w:sz w:val="26"/>
           <w:szCs w:val="26"/>
         </w:rPr>
-        <w:t xml:space="preserve"> </w:t>
-      </w:r>
-      <w:proofErr w:type="spellStart"/>
-      <w:r>
-        <w:rPr>
-          <w:sz w:val="26"/>
-          <w:szCs w:val="26"/>
-        </w:rPr>
-        <w:t>Quý</w:t>
-      </w:r>
-      <w:proofErr w:type="spellEnd"/>
-      <w:r>
-        <w:rPr>
-          <w:sz w:val="26"/>
-          <w:szCs w:val="26"/>
-        </w:rPr>
-        <w:t xml:space="preserve"> </w:t>
+        <w:t xml:space="preserve"> Quý </w:t>
       </w:r>
       <w:proofErr w:type="spellStart"/>
       <w:r>
@@ -1197,21 +1021,12 @@
           <w:szCs w:val="26"/>
         </w:rPr>
       </w:pPr>
-      <w:proofErr w:type="spellStart"/>
-      <w:r>
-        <w:rPr>
-          <w:sz w:val="26"/>
-          <w:szCs w:val="26"/>
-        </w:rPr>
-        <w:t>Trân</w:t>
-      </w:r>
-      <w:proofErr w:type="spellEnd"/>
-      <w:r>
-        <w:rPr>
-          <w:sz w:val="26"/>
-          <w:szCs w:val="26"/>
-        </w:rPr>
-        <w:t xml:space="preserve"> </w:t>
+      <w:r>
+        <w:rPr>
+          <w:sz w:val="26"/>
+          <w:szCs w:val="26"/>
+        </w:rPr>
+        <w:t xml:space="preserve">Trân </w:t>
       </w:r>
       <w:proofErr w:type="spellStart"/>
       <w:r>
@@ -1320,16 +1135,6 @@
                 <w:szCs w:val="26"/>
               </w:rPr>
             </w:pPr>
-            <w:proofErr w:type="spellStart"/>
-            <w:proofErr w:type="spellEnd"/>
-            <w:proofErr w:type="spellStart"/>
-            <w:proofErr w:type="spellEnd"/>
-            <w:proofErr w:type="spellStart"/>
-            <w:proofErr w:type="spellEnd"/>
-            <w:proofErr w:type="spellStart"/>
-            <w:proofErr w:type="spellEnd"/>
-            <w:proofErr w:type="spellStart"/>
-            <w:proofErr w:type="spellEnd"/>
             <w:r>
               <w:rPr>
                 <w:i/>
@@ -1495,12 +1300,6 @@
                 <w:szCs w:val="26"/>
               </w:rPr>
             </w:pPr>
-            <w:proofErr w:type="spellStart"/>
-            <w:proofErr w:type="spellEnd"/>
-            <w:proofErr w:type="spellStart"/>
-            <w:proofErr w:type="spellEnd"/>
-            <w:proofErr w:type="spellStart"/>
-            <w:proofErr w:type="spellEnd"/>
             <w:r>
               <w:rPr>
                 <w:b/>
@@ -1548,7 +1347,6 @@
                 <w:szCs w:val="26"/>
               </w:rPr>
             </w:pPr>
-            <w:r/>
           </w:p>
           <w:p>
             <w:pPr>
@@ -1563,7 +1361,6 @@
                 <w:szCs w:val="26"/>
               </w:rPr>
             </w:pPr>
-            <w:r/>
           </w:p>
           <w:p>
             <w:pPr>
@@ -1578,7 +1375,6 @@
                 <w:szCs w:val="26"/>
               </w:rPr>
             </w:pPr>
-            <w:r/>
           </w:p>
           <w:p>
             <w:pPr>
@@ -1593,7 +1389,6 @@
                 <w:szCs w:val="26"/>
               </w:rPr>
             </w:pPr>
-            <w:r/>
           </w:p>
           <w:p>
             <w:pPr>
@@ -1611,7 +1406,6 @@
             <w:r>
               <w:rPr>
                 <w:b/>
-                <w:i w:val="0"/>
               </w:rPr>
               <w:t>{{ full_name }}</w:t>
             </w:r>
@@ -1629,7 +1423,6 @@
                 <w:szCs w:val="26"/>
               </w:rPr>
             </w:pPr>
-            <w:r/>
           </w:p>
         </w:tc>
       </w:tr>
@@ -1644,7 +1437,6 @@
           </w:tcPr>
           <w:p>
             <w:pPr>
-              <w:pageBreakBefore/>
               <w:tabs>
                 <w:tab w:val="left" w:leader="dot" w:pos="9071"/>
               </w:tabs>
@@ -1723,17 +1515,6 @@
                 <w:sz w:val="26"/>
                 <w:szCs w:val="26"/>
               </w:rPr>
-              <w:t xml:space="preserve"> đạo</w:t>
-            </w:r>
-            <w:bookmarkStart w:id="0" w:name="_GoBack"/>
-            <w:bookmarkEnd w:id="0"/>
-            <w:r>
-              <w:rPr>
-                <w:b/>
-                <w:bCs/>
-                <w:sz w:val="26"/>
-                <w:szCs w:val="26"/>
-              </w:rPr>
               <w:t xml:space="preserve"> </w:t>
             </w:r>
             <w:proofErr w:type="spellStart"/>
@@ -1744,9 +1525,18 @@
                 <w:sz w:val="26"/>
                 <w:szCs w:val="26"/>
               </w:rPr>
-              <w:t>Khoa</w:t>
+              <w:t>đạo</w:t>
             </w:r>
             <w:proofErr w:type="spellEnd"/>
+            <w:r>
+              <w:rPr>
+                <w:b/>
+                <w:bCs/>
+                <w:sz w:val="26"/>
+                <w:szCs w:val="26"/>
+              </w:rPr>
+              <w:t xml:space="preserve"> Khoa</w:t>
+            </w:r>
           </w:p>
           <w:p>
             <w:pPr>
@@ -1799,7 +1589,7 @@
 </file>
 
 <file path=word/styles.xml><?xml version="1.0" encoding="utf-8"?>
-<w:styles xmlns:mc="http://schemas.openxmlformats.org/markup-compatibility/2006" xmlns:r="http://schemas.openxmlformats.org/officeDocument/2006/relationships" xmlns:w="http://schemas.openxmlformats.org/wordprocessingml/2006/main" xmlns:w14="http://schemas.microsoft.com/office/word/2010/wordml" xmlns:w15="http://schemas.microsoft.com/office/word/2012/wordml" xmlns:w16se="http://schemas.microsoft.com/office/word/2015/wordml/symex" mc:Ignorable="w14 w15 w16se">
+<w:styles xmlns:mc="http://schemas.openxmlformats.org/markup-compatibility/2006" xmlns:r="http://schemas.openxmlformats.org/officeDocument/2006/relationships" xmlns:w="http://schemas.openxmlformats.org/wordprocessingml/2006/main" xmlns:w14="http://schemas.microsoft.com/office/word/2010/wordml" xmlns:w15="http://schemas.microsoft.com/office/word/2012/wordml" xmlns:w16cex="http://schemas.microsoft.com/office/word/2018/wordml/cex" xmlns:w16cid="http://schemas.microsoft.com/office/word/2016/wordml/cid" xmlns:w16="http://schemas.microsoft.com/office/word/2018/wordml" xmlns:w16du="http://schemas.microsoft.com/office/word/2023/wordml/word16du" xmlns:w16sdtdh="http://schemas.microsoft.com/office/word/2020/wordml/sdtdatahash" xmlns:w16sdtfl="http://schemas.microsoft.com/office/word/2024/wordml/sdtformatlock" xmlns:w16se="http://schemas.microsoft.com/office/word/2015/wordml/symex" mc:Ignorable="w14 w15 w16se w16cid w16 w16cex w16sdtdh w16sdtfl w16du">
   <w:docDefaults>
     <w:rPrDefault>
       <w:rPr>
@@ -1815,7 +1605,7 @@
       </w:pPr>
     </w:pPrDefault>
   </w:docDefaults>
-  <w:latentStyles w:defLockedState="0" w:defUIPriority="99" w:defSemiHidden="0" w:defUnhideWhenUsed="0" w:defQFormat="0" w:count="371">
+  <w:latentStyles w:defLockedState="0" w:defUIPriority="99" w:defSemiHidden="0" w:defUnhideWhenUsed="0" w:defQFormat="0" w:count="376">
     <w:lsdException w:name="Normal" w:uiPriority="0" w:qFormat="1"/>
     <w:lsdException w:name="heading 1" w:uiPriority="9" w:qFormat="1"/>
     <w:lsdException w:name="heading 2" w:semiHidden="1" w:uiPriority="9" w:unhideWhenUsed="1" w:qFormat="1"/>
@@ -2187,6 +1977,11 @@
     <w:lsdException w:name="List Table 5 Dark Accent 6" w:uiPriority="50"/>
     <w:lsdException w:name="List Table 6 Colorful Accent 6" w:uiPriority="51"/>
     <w:lsdException w:name="List Table 7 Colorful Accent 6" w:uiPriority="52"/>
+    <w:lsdException w:name="Mention" w:semiHidden="1" w:unhideWhenUsed="1"/>
+    <w:lsdException w:name="Smart Hyperlink" w:semiHidden="1" w:unhideWhenUsed="1"/>
+    <w:lsdException w:name="Hashtag" w:semiHidden="1" w:unhideWhenUsed="1"/>
+    <w:lsdException w:name="Unresolved Mention" w:semiHidden="1" w:unhideWhenUsed="1"/>
+    <w:lsdException w:name="Smart Link" w:semiHidden="1" w:unhideWhenUsed="1"/>
   </w:latentStyles>
   <w:style w:type="paragraph" w:default="1" w:styleId="Normal">
     <w:name w:val="Normal"/>

</xml_diff>